<commit_message>
Update multi-agent TMF intent fulfillment document with new content
</commit_message>
<xml_diff>
--- a/AgentSyntheticTimeseriesGeneration/multi-agent-tmf-intent-fulfillment-observation-simulation-platform.docx
+++ b/AgentSyntheticTimeseriesGeneration/multi-agent-tmf-intent-fulfillment-observation-simulation-platform.docx
@@ -162,10 +162,13 @@
       </w:r>
     </w:p>
     <w:p>
+      <w:pPr>
+        <w:jc w:val="center"/>
+      </w:pPr>
       <w:r>
         <w:drawing>
           <wp:inline xmlns:a="http://schemas.openxmlformats.org/drawingml/2006/main" xmlns:pic="http://schemas.openxmlformats.org/drawingml/2006/picture">
-            <wp:extent cx="5806440" cy="3252241"/>
+            <wp:extent cx="6611781" cy="3703320"/>
             <wp:docPr id="1" name="Picture 1"/>
             <wp:cNvGraphicFramePr>
               <a:graphicFrameLocks noChangeAspect="1"/>
@@ -186,7 +189,7 @@
                   <pic:spPr>
                     <a:xfrm>
                       <a:off x="0" y="0"/>
-                      <a:ext cx="5806440" cy="3252241"/>
+                      <a:ext cx="6611781" cy="3703320"/>
                     </a:xfrm>
                     <a:prstGeom prst="rect"/>
                   </pic:spPr>
@@ -207,6 +210,16 @@
         </w:rPr>
         <w:t>Figure 1. Logical architecture for the proposed platform.</w:t>
       </w:r>
+    </w:p>
+    <w:p>
+      <w:pPr>
+        <w:sectPr>
+          <w:pgSz w:w="12240" w:h="15840"/>
+          <w:pgMar w:top="648" w:right="648" w:bottom="648" w:left="648" w:header="720" w:footer="720" w:gutter="0"/>
+          <w:cols w:space="720"/>
+          <w:docGrid w:linePitch="360"/>
+        </w:sectPr>
+      </w:pPr>
     </w:p>
     <w:p>
       <w:pPr>
@@ -562,6 +575,7 @@
       </w:r>
     </w:p>
     <w:sectPr>
+      <w:type w:val="continuous"/>
       <w:pgSz w:w="12240" w:h="15840"/>
       <w:pgMar w:top="1008" w:right="1152" w:bottom="1008" w:left="1152" w:header="720" w:footer="720" w:gutter="0"/>
       <w:cols w:space="720"/>

</xml_diff>